<commit_message>
Update README and user guide to reflect all new features
Covers: draft auto-save, claim history, currency selector, client-side
image compression, admin archive/unarchive, Show Archived toggle,
monthly ZIP export with item-numbered receipts, submit on behalf of
employee, and user management (display name + password reset).

Co-Authored-By: Claude Sonnet 4.6 <noreply@anthropic.com>
</commit_message>
<xml_diff>
--- a/Ternary_Claim_Portal_User_Guide.docx
+++ b/Ternary_Claim_Portal_User_Guide.docx
@@ -1135,809 +1135,243 @@
         </w:tc>
       </w:tr>
       <w:tr>
-        <w:tblPrEx>
-          <w:tblCellMar>
-            <w:top w:w="0" w:type="dxa"/>
-            <w:bottom w:w="0" w:type="dxa"/>
-          </w:tblCellMar>
-        </w:tblPrEx>
-        <w:trPr>
-          <w:cantSplit/>
-        </w:trPr>
         <w:tc>
           <w:tcPr>
-            <w:tcW w:w="4513" w:type="dxa"/>
-            <w:tcBorders>
-              <w:top w:val="single" w:sz="2" w:space="0" w:color="C8CDD5"/>
-              <w:left w:val="single" w:sz="2" w:space="0" w:color="C8CDD5"/>
-              <w:bottom w:val="single" w:sz="2" w:space="0" w:color="C8CDD5"/>
-              <w:right w:val="single" w:sz="2" w:space="0" w:color="C8CDD5"/>
-            </w:tcBorders>
-            <w:tcMar>
-              <w:top w:w="80" w:type="dxa"/>
-              <w:left w:w="120" w:type="dxa"/>
-              <w:bottom w:w="80" w:type="dxa"/>
-              <w:right w:w="120" w:type="dxa"/>
-            </w:tcMar>
-            <w:vAlign w:val="center"/>
+            <w:tcW w:type="dxa" w:w="4513"/>
           </w:tcPr>
           <w:p>
             <w:r>
-              <w:rPr>
-                <w:sz w:val="20"/>
-                <w:szCs w:val="20"/>
-              </w:rPr>
               <w:t>admin</w:t>
             </w:r>
           </w:p>
         </w:tc>
         <w:tc>
           <w:tcPr>
-            <w:tcW w:w="4513" w:type="dxa"/>
-            <w:tcBorders>
-              <w:top w:val="single" w:sz="2" w:space="0" w:color="C8CDD5"/>
-              <w:left w:val="single" w:sz="2" w:space="0" w:color="C8CDD5"/>
-              <w:bottom w:val="single" w:sz="2" w:space="0" w:color="C8CDD5"/>
-              <w:right w:val="single" w:sz="2" w:space="0" w:color="C8CDD5"/>
-            </w:tcBorders>
-            <w:tcMar>
-              <w:top w:w="80" w:type="dxa"/>
-              <w:left w:w="120" w:type="dxa"/>
-              <w:bottom w:w="80" w:type="dxa"/>
-              <w:right w:w="120" w:type="dxa"/>
-            </w:tcMar>
-            <w:vAlign w:val="center"/>
+            <w:tcW w:type="dxa" w:w="4513"/>
           </w:tcPr>
           <w:p>
             <w:r>
-              <w:rPr>
-                <w:sz w:val="20"/>
-                <w:szCs w:val="20"/>
-              </w:rPr>
               <w:t>Admin</w:t>
             </w:r>
           </w:p>
         </w:tc>
       </w:tr>
       <w:tr>
-        <w:tblPrEx>
-          <w:tblCellMar>
-            <w:top w:w="0" w:type="dxa"/>
-            <w:bottom w:w="0" w:type="dxa"/>
-          </w:tblCellMar>
-        </w:tblPrEx>
-        <w:trPr>
-          <w:cantSplit/>
-        </w:trPr>
         <w:tc>
           <w:tcPr>
-            <w:tcW w:w="4513" w:type="dxa"/>
-            <w:tcBorders>
-              <w:top w:val="single" w:sz="2" w:space="0" w:color="C8CDD5"/>
-              <w:left w:val="single" w:sz="2" w:space="0" w:color="C8CDD5"/>
-              <w:bottom w:val="single" w:sz="2" w:space="0" w:color="C8CDD5"/>
-              <w:right w:val="single" w:sz="2" w:space="0" w:color="C8CDD5"/>
-            </w:tcBorders>
-            <w:tcMar>
-              <w:top w:w="80" w:type="dxa"/>
-              <w:left w:w="120" w:type="dxa"/>
-              <w:bottom w:w="80" w:type="dxa"/>
-              <w:right w:w="120" w:type="dxa"/>
-            </w:tcMar>
-            <w:vAlign w:val="center"/>
+            <w:tcW w:type="dxa" w:w="4513"/>
           </w:tcPr>
           <w:p>
             <w:r>
-              <w:rPr>
-                <w:sz w:val="20"/>
-                <w:szCs w:val="20"/>
-              </w:rPr>
               <w:t>edward</w:t>
             </w:r>
           </w:p>
         </w:tc>
         <w:tc>
           <w:tcPr>
-            <w:tcW w:w="4513" w:type="dxa"/>
-            <w:tcBorders>
-              <w:top w:val="single" w:sz="2" w:space="0" w:color="C8CDD5"/>
-              <w:left w:val="single" w:sz="2" w:space="0" w:color="C8CDD5"/>
-              <w:bottom w:val="single" w:sz="2" w:space="0" w:color="C8CDD5"/>
-              <w:right w:val="single" w:sz="2" w:space="0" w:color="C8CDD5"/>
-            </w:tcBorders>
-            <w:tcMar>
-              <w:top w:w="80" w:type="dxa"/>
-              <w:left w:w="120" w:type="dxa"/>
-              <w:bottom w:w="80" w:type="dxa"/>
-              <w:right w:w="120" w:type="dxa"/>
-            </w:tcMar>
-            <w:vAlign w:val="center"/>
+            <w:tcW w:type="dxa" w:w="4513"/>
           </w:tcPr>
           <w:p>
             <w:r>
-              <w:rPr>
-                <w:sz w:val="20"/>
-                <w:szCs w:val="20"/>
-              </w:rPr>
-              <w:t>User</w:t>
+              <w:t>Employee</w:t>
             </w:r>
           </w:p>
         </w:tc>
       </w:tr>
       <w:tr>
-        <w:tblPrEx>
-          <w:tblCellMar>
-            <w:top w:w="0" w:type="dxa"/>
-            <w:bottom w:w="0" w:type="dxa"/>
-          </w:tblCellMar>
-        </w:tblPrEx>
-        <w:trPr>
-          <w:cantSplit/>
-        </w:trPr>
         <w:tc>
           <w:tcPr>
-            <w:tcW w:w="4513" w:type="dxa"/>
-            <w:tcBorders>
-              <w:top w:val="single" w:sz="2" w:space="0" w:color="C8CDD5"/>
-              <w:left w:val="single" w:sz="2" w:space="0" w:color="C8CDD5"/>
-              <w:bottom w:val="single" w:sz="2" w:space="0" w:color="C8CDD5"/>
-              <w:right w:val="single" w:sz="2" w:space="0" w:color="C8CDD5"/>
-            </w:tcBorders>
-            <w:tcMar>
-              <w:top w:w="80" w:type="dxa"/>
-              <w:left w:w="120" w:type="dxa"/>
-              <w:bottom w:w="80" w:type="dxa"/>
-              <w:right w:w="120" w:type="dxa"/>
-            </w:tcMar>
-            <w:vAlign w:val="center"/>
+            <w:tcW w:type="dxa" w:w="4513"/>
           </w:tcPr>
           <w:p>
             <w:r>
-              <w:rPr>
-                <w:sz w:val="20"/>
-                <w:szCs w:val="20"/>
-              </w:rPr>
               <w:t>jason</w:t>
-            </w:r>
-            <w:r>
-              <w:rPr>
-                <w:sz w:val="20"/>
-                <w:szCs w:val="20"/>
-              </w:rPr>
-              <w:t xml:space="preserve"> </w:t>
             </w:r>
           </w:p>
         </w:tc>
         <w:tc>
           <w:tcPr>
-            <w:tcW w:w="4513" w:type="dxa"/>
-            <w:tcBorders>
-              <w:top w:val="single" w:sz="2" w:space="0" w:color="C8CDD5"/>
-              <w:left w:val="single" w:sz="2" w:space="0" w:color="C8CDD5"/>
-              <w:bottom w:val="single" w:sz="2" w:space="0" w:color="C8CDD5"/>
-              <w:right w:val="single" w:sz="2" w:space="0" w:color="C8CDD5"/>
-            </w:tcBorders>
-            <w:tcMar>
-              <w:top w:w="80" w:type="dxa"/>
-              <w:left w:w="120" w:type="dxa"/>
-              <w:bottom w:w="80" w:type="dxa"/>
-              <w:right w:w="120" w:type="dxa"/>
-            </w:tcMar>
-            <w:vAlign w:val="center"/>
+            <w:tcW w:type="dxa" w:w="4513"/>
           </w:tcPr>
           <w:p>
             <w:r>
-              <w:rPr>
-                <w:sz w:val="20"/>
-                <w:szCs w:val="20"/>
-              </w:rPr>
-              <w:t>User</w:t>
+              <w:t>Employee</w:t>
             </w:r>
           </w:p>
         </w:tc>
       </w:tr>
       <w:tr>
-        <w:tblPrEx>
-          <w:tblCellMar>
-            <w:top w:w="0" w:type="dxa"/>
-            <w:bottom w:w="0" w:type="dxa"/>
-          </w:tblCellMar>
-        </w:tblPrEx>
-        <w:trPr>
-          <w:cantSplit/>
-        </w:trPr>
         <w:tc>
           <w:tcPr>
-            <w:tcW w:w="4513" w:type="dxa"/>
-            <w:tcBorders>
-              <w:top w:val="single" w:sz="2" w:space="0" w:color="C8CDD5"/>
-              <w:left w:val="single" w:sz="2" w:space="0" w:color="C8CDD5"/>
-              <w:bottom w:val="single" w:sz="2" w:space="0" w:color="C8CDD5"/>
-              <w:right w:val="single" w:sz="2" w:space="0" w:color="C8CDD5"/>
-            </w:tcBorders>
-            <w:tcMar>
-              <w:top w:w="80" w:type="dxa"/>
-              <w:left w:w="120" w:type="dxa"/>
-              <w:bottom w:w="80" w:type="dxa"/>
-              <w:right w:w="120" w:type="dxa"/>
-            </w:tcMar>
-            <w:vAlign w:val="center"/>
+            <w:tcW w:type="dxa" w:w="4513"/>
           </w:tcPr>
           <w:p>
             <w:r>
-              <w:rPr>
-                <w:sz w:val="20"/>
-                <w:szCs w:val="20"/>
-              </w:rPr>
-              <w:t>p</w:t>
-            </w:r>
-            <w:r>
-              <w:rPr>
-                <w:sz w:val="20"/>
-                <w:szCs w:val="20"/>
-              </w:rPr>
-              <w:t>eter</w:t>
+              <w:t>peter</w:t>
             </w:r>
           </w:p>
         </w:tc>
         <w:tc>
           <w:tcPr>
-            <w:tcW w:w="4513" w:type="dxa"/>
-            <w:tcBorders>
-              <w:top w:val="single" w:sz="2" w:space="0" w:color="C8CDD5"/>
-              <w:left w:val="single" w:sz="2" w:space="0" w:color="C8CDD5"/>
-              <w:bottom w:val="single" w:sz="2" w:space="0" w:color="C8CDD5"/>
-              <w:right w:val="single" w:sz="2" w:space="0" w:color="C8CDD5"/>
-            </w:tcBorders>
-            <w:tcMar>
-              <w:top w:w="80" w:type="dxa"/>
-              <w:left w:w="120" w:type="dxa"/>
-              <w:bottom w:w="80" w:type="dxa"/>
-              <w:right w:w="120" w:type="dxa"/>
-            </w:tcMar>
-            <w:vAlign w:val="center"/>
+            <w:tcW w:type="dxa" w:w="4513"/>
           </w:tcPr>
           <w:p>
             <w:r>
-              <w:rPr>
-                <w:sz w:val="20"/>
-                <w:szCs w:val="20"/>
-              </w:rPr>
-              <w:t>User</w:t>
+              <w:t>Employee</w:t>
             </w:r>
           </w:p>
         </w:tc>
       </w:tr>
       <w:tr>
-        <w:tblPrEx>
-          <w:tblCellMar>
-            <w:top w:w="0" w:type="dxa"/>
-            <w:bottom w:w="0" w:type="dxa"/>
-          </w:tblCellMar>
-        </w:tblPrEx>
-        <w:trPr>
-          <w:cantSplit/>
-        </w:trPr>
         <w:tc>
           <w:tcPr>
-            <w:tcW w:w="4513" w:type="dxa"/>
-            <w:tcBorders>
-              <w:top w:val="single" w:sz="2" w:space="0" w:color="C8CDD5"/>
-              <w:left w:val="single" w:sz="2" w:space="0" w:color="C8CDD5"/>
-              <w:bottom w:val="single" w:sz="2" w:space="0" w:color="C8CDD5"/>
-              <w:right w:val="single" w:sz="2" w:space="0" w:color="C8CDD5"/>
-            </w:tcBorders>
-            <w:tcMar>
-              <w:top w:w="80" w:type="dxa"/>
-              <w:left w:w="120" w:type="dxa"/>
-              <w:bottom w:w="80" w:type="dxa"/>
-              <w:right w:w="120" w:type="dxa"/>
-            </w:tcMar>
-            <w:vAlign w:val="center"/>
+            <w:tcW w:type="dxa" w:w="4513"/>
           </w:tcPr>
           <w:p>
             <w:r>
-              <w:rPr>
-                <w:sz w:val="20"/>
-                <w:szCs w:val="20"/>
-              </w:rPr>
-              <w:t>m</w:t>
-            </w:r>
-            <w:r>
-              <w:rPr>
-                <w:sz w:val="20"/>
-                <w:szCs w:val="20"/>
-              </w:rPr>
-              <w:t>ary</w:t>
+              <w:t>mary</w:t>
             </w:r>
           </w:p>
         </w:tc>
         <w:tc>
           <w:tcPr>
-            <w:tcW w:w="4513" w:type="dxa"/>
-            <w:tcBorders>
-              <w:top w:val="single" w:sz="2" w:space="0" w:color="C8CDD5"/>
-              <w:left w:val="single" w:sz="2" w:space="0" w:color="C8CDD5"/>
-              <w:bottom w:val="single" w:sz="2" w:space="0" w:color="C8CDD5"/>
-              <w:right w:val="single" w:sz="2" w:space="0" w:color="C8CDD5"/>
-            </w:tcBorders>
-            <w:tcMar>
-              <w:top w:w="80" w:type="dxa"/>
-              <w:left w:w="120" w:type="dxa"/>
-              <w:bottom w:w="80" w:type="dxa"/>
-              <w:right w:w="120" w:type="dxa"/>
-            </w:tcMar>
-            <w:vAlign w:val="center"/>
+            <w:tcW w:type="dxa" w:w="4513"/>
           </w:tcPr>
           <w:p>
             <w:r>
-              <w:rPr>
-                <w:sz w:val="20"/>
-                <w:szCs w:val="20"/>
-              </w:rPr>
-              <w:t>User</w:t>
+              <w:t>Employee</w:t>
             </w:r>
           </w:p>
         </w:tc>
       </w:tr>
       <w:tr>
-        <w:tblPrEx>
-          <w:tblCellMar>
-            <w:top w:w="0" w:type="dxa"/>
-            <w:bottom w:w="0" w:type="dxa"/>
-          </w:tblCellMar>
-        </w:tblPrEx>
-        <w:trPr>
-          <w:cantSplit/>
-        </w:trPr>
         <w:tc>
           <w:tcPr>
-            <w:tcW w:w="4513" w:type="dxa"/>
-            <w:tcBorders>
-              <w:top w:val="single" w:sz="2" w:space="0" w:color="C8CDD5"/>
-              <w:left w:val="single" w:sz="2" w:space="0" w:color="C8CDD5"/>
-              <w:bottom w:val="single" w:sz="2" w:space="0" w:color="C8CDD5"/>
-              <w:right w:val="single" w:sz="2" w:space="0" w:color="C8CDD5"/>
-            </w:tcBorders>
-            <w:tcMar>
-              <w:top w:w="80" w:type="dxa"/>
-              <w:left w:w="120" w:type="dxa"/>
-              <w:bottom w:w="80" w:type="dxa"/>
-              <w:right w:w="120" w:type="dxa"/>
-            </w:tcMar>
-            <w:vAlign w:val="center"/>
+            <w:tcW w:type="dxa" w:w="4513"/>
           </w:tcPr>
           <w:p>
-            <w:pPr>
-              <w:rPr>
-                <w:sz w:val="20"/>
-                <w:szCs w:val="20"/>
-              </w:rPr>
-            </w:pPr>
             <w:r>
-              <w:rPr>
-                <w:sz w:val="20"/>
-                <w:szCs w:val="20"/>
-              </w:rPr>
               <w:t>hannah</w:t>
             </w:r>
           </w:p>
         </w:tc>
         <w:tc>
           <w:tcPr>
-            <w:tcW w:w="4513" w:type="dxa"/>
-            <w:tcBorders>
-              <w:top w:val="single" w:sz="2" w:space="0" w:color="C8CDD5"/>
-              <w:left w:val="single" w:sz="2" w:space="0" w:color="C8CDD5"/>
-              <w:bottom w:val="single" w:sz="2" w:space="0" w:color="C8CDD5"/>
-              <w:right w:val="single" w:sz="2" w:space="0" w:color="C8CDD5"/>
-            </w:tcBorders>
-            <w:tcMar>
-              <w:top w:w="80" w:type="dxa"/>
-              <w:left w:w="120" w:type="dxa"/>
-              <w:bottom w:w="80" w:type="dxa"/>
-              <w:right w:w="120" w:type="dxa"/>
-            </w:tcMar>
-            <w:vAlign w:val="center"/>
+            <w:tcW w:type="dxa" w:w="4513"/>
           </w:tcPr>
           <w:p>
-            <w:pPr>
-              <w:rPr>
-                <w:sz w:val="20"/>
-                <w:szCs w:val="20"/>
-              </w:rPr>
-            </w:pPr>
             <w:r>
-              <w:rPr>
-                <w:sz w:val="20"/>
-                <w:szCs w:val="20"/>
-              </w:rPr>
-              <w:t>User</w:t>
+              <w:t>Employee</w:t>
             </w:r>
           </w:p>
         </w:tc>
       </w:tr>
       <w:tr>
-        <w:tblPrEx>
-          <w:tblCellMar>
-            <w:top w:w="0" w:type="dxa"/>
-            <w:bottom w:w="0" w:type="dxa"/>
-          </w:tblCellMar>
-        </w:tblPrEx>
-        <w:trPr>
-          <w:cantSplit/>
-        </w:trPr>
         <w:tc>
           <w:tcPr>
-            <w:tcW w:w="4513" w:type="dxa"/>
-            <w:tcBorders>
-              <w:top w:val="single" w:sz="2" w:space="0" w:color="C8CDD5"/>
-              <w:left w:val="single" w:sz="2" w:space="0" w:color="C8CDD5"/>
-              <w:bottom w:val="single" w:sz="2" w:space="0" w:color="C8CDD5"/>
-              <w:right w:val="single" w:sz="2" w:space="0" w:color="C8CDD5"/>
-            </w:tcBorders>
-            <w:tcMar>
-              <w:top w:w="80" w:type="dxa"/>
-              <w:left w:w="120" w:type="dxa"/>
-              <w:bottom w:w="80" w:type="dxa"/>
-              <w:right w:w="120" w:type="dxa"/>
-            </w:tcMar>
-            <w:vAlign w:val="center"/>
+            <w:tcW w:type="dxa" w:w="4513"/>
           </w:tcPr>
           <w:p>
-            <w:pPr>
-              <w:rPr>
-                <w:sz w:val="20"/>
-                <w:szCs w:val="20"/>
-              </w:rPr>
-            </w:pPr>
             <w:r>
-              <w:rPr>
-                <w:sz w:val="20"/>
-                <w:szCs w:val="20"/>
-              </w:rPr>
               <w:t>thomas</w:t>
             </w:r>
           </w:p>
         </w:tc>
         <w:tc>
           <w:tcPr>
-            <w:tcW w:w="4513" w:type="dxa"/>
-            <w:tcBorders>
-              <w:top w:val="single" w:sz="2" w:space="0" w:color="C8CDD5"/>
-              <w:left w:val="single" w:sz="2" w:space="0" w:color="C8CDD5"/>
-              <w:bottom w:val="single" w:sz="2" w:space="0" w:color="C8CDD5"/>
-              <w:right w:val="single" w:sz="2" w:space="0" w:color="C8CDD5"/>
-            </w:tcBorders>
-            <w:tcMar>
-              <w:top w:w="80" w:type="dxa"/>
-              <w:left w:w="120" w:type="dxa"/>
-              <w:bottom w:w="80" w:type="dxa"/>
-              <w:right w:w="120" w:type="dxa"/>
-            </w:tcMar>
-            <w:vAlign w:val="center"/>
+            <w:tcW w:type="dxa" w:w="4513"/>
           </w:tcPr>
           <w:p>
-            <w:pPr>
-              <w:rPr>
-                <w:sz w:val="20"/>
-                <w:szCs w:val="20"/>
-              </w:rPr>
-            </w:pPr>
             <w:r>
-              <w:rPr>
-                <w:sz w:val="20"/>
-                <w:szCs w:val="20"/>
-              </w:rPr>
-              <w:t>User</w:t>
+              <w:t>Employee</w:t>
             </w:r>
           </w:p>
         </w:tc>
       </w:tr>
       <w:tr>
-        <w:tblPrEx>
-          <w:tblCellMar>
-            <w:top w:w="0" w:type="dxa"/>
-            <w:bottom w:w="0" w:type="dxa"/>
-          </w:tblCellMar>
-        </w:tblPrEx>
-        <w:trPr>
-          <w:cantSplit/>
-        </w:trPr>
         <w:tc>
           <w:tcPr>
-            <w:tcW w:w="4513" w:type="dxa"/>
-            <w:tcBorders>
-              <w:top w:val="single" w:sz="2" w:space="0" w:color="C8CDD5"/>
-              <w:left w:val="single" w:sz="2" w:space="0" w:color="C8CDD5"/>
-              <w:bottom w:val="single" w:sz="2" w:space="0" w:color="C8CDD5"/>
-              <w:right w:val="single" w:sz="2" w:space="0" w:color="C8CDD5"/>
-            </w:tcBorders>
-            <w:tcMar>
-              <w:top w:w="80" w:type="dxa"/>
-              <w:left w:w="120" w:type="dxa"/>
-              <w:bottom w:w="80" w:type="dxa"/>
-              <w:right w:w="120" w:type="dxa"/>
-            </w:tcMar>
-            <w:vAlign w:val="center"/>
+            <w:tcW w:type="dxa" w:w="4513"/>
           </w:tcPr>
           <w:p>
-            <w:pPr>
-              <w:rPr>
-                <w:sz w:val="20"/>
-                <w:szCs w:val="20"/>
-              </w:rPr>
-            </w:pPr>
             <w:r>
-              <w:rPr>
-                <w:sz w:val="20"/>
-                <w:szCs w:val="20"/>
-              </w:rPr>
               <w:t>chuiwhei</w:t>
             </w:r>
           </w:p>
         </w:tc>
         <w:tc>
           <w:tcPr>
-            <w:tcW w:w="4513" w:type="dxa"/>
-            <w:tcBorders>
-              <w:top w:val="single" w:sz="2" w:space="0" w:color="C8CDD5"/>
-              <w:left w:val="single" w:sz="2" w:space="0" w:color="C8CDD5"/>
-              <w:bottom w:val="single" w:sz="2" w:space="0" w:color="C8CDD5"/>
-              <w:right w:val="single" w:sz="2" w:space="0" w:color="C8CDD5"/>
-            </w:tcBorders>
-            <w:tcMar>
-              <w:top w:w="80" w:type="dxa"/>
-              <w:left w:w="120" w:type="dxa"/>
-              <w:bottom w:w="80" w:type="dxa"/>
-              <w:right w:w="120" w:type="dxa"/>
-            </w:tcMar>
-            <w:vAlign w:val="center"/>
+            <w:tcW w:type="dxa" w:w="4513"/>
           </w:tcPr>
           <w:p>
-            <w:pPr>
-              <w:rPr>
-                <w:sz w:val="20"/>
-                <w:szCs w:val="20"/>
-              </w:rPr>
-            </w:pPr>
             <w:r>
-              <w:rPr>
-                <w:sz w:val="20"/>
-                <w:szCs w:val="20"/>
-              </w:rPr>
-              <w:t>User</w:t>
+              <w:t>Employee</w:t>
             </w:r>
           </w:p>
         </w:tc>
       </w:tr>
       <w:tr>
-        <w:tblPrEx>
-          <w:tblCellMar>
-            <w:top w:w="0" w:type="dxa"/>
-            <w:bottom w:w="0" w:type="dxa"/>
-          </w:tblCellMar>
-        </w:tblPrEx>
-        <w:trPr>
-          <w:cantSplit/>
-        </w:trPr>
         <w:tc>
           <w:tcPr>
-            <w:tcW w:w="4513" w:type="dxa"/>
-            <w:tcBorders>
-              <w:top w:val="single" w:sz="2" w:space="0" w:color="C8CDD5"/>
-              <w:left w:val="single" w:sz="2" w:space="0" w:color="C8CDD5"/>
-              <w:bottom w:val="single" w:sz="2" w:space="0" w:color="C8CDD5"/>
-              <w:right w:val="single" w:sz="2" w:space="0" w:color="C8CDD5"/>
-            </w:tcBorders>
-            <w:tcMar>
-              <w:top w:w="80" w:type="dxa"/>
-              <w:left w:w="120" w:type="dxa"/>
-              <w:bottom w:w="80" w:type="dxa"/>
-              <w:right w:w="120" w:type="dxa"/>
-            </w:tcMar>
-            <w:vAlign w:val="center"/>
+            <w:tcW w:type="dxa" w:w="4513"/>
           </w:tcPr>
           <w:p>
-            <w:pPr>
-              <w:rPr>
-                <w:sz w:val="20"/>
-                <w:szCs w:val="20"/>
-              </w:rPr>
-            </w:pPr>
             <w:r>
-              <w:rPr>
-                <w:sz w:val="20"/>
-                <w:szCs w:val="20"/>
-              </w:rPr>
               <w:t>xingye</w:t>
             </w:r>
           </w:p>
         </w:tc>
         <w:tc>
           <w:tcPr>
-            <w:tcW w:w="4513" w:type="dxa"/>
-            <w:tcBorders>
-              <w:top w:val="single" w:sz="2" w:space="0" w:color="C8CDD5"/>
-              <w:left w:val="single" w:sz="2" w:space="0" w:color="C8CDD5"/>
-              <w:bottom w:val="single" w:sz="2" w:space="0" w:color="C8CDD5"/>
-              <w:right w:val="single" w:sz="2" w:space="0" w:color="C8CDD5"/>
-            </w:tcBorders>
-            <w:tcMar>
-              <w:top w:w="80" w:type="dxa"/>
-              <w:left w:w="120" w:type="dxa"/>
-              <w:bottom w:w="80" w:type="dxa"/>
-              <w:right w:w="120" w:type="dxa"/>
-            </w:tcMar>
-            <w:vAlign w:val="center"/>
+            <w:tcW w:type="dxa" w:w="4513"/>
           </w:tcPr>
           <w:p>
-            <w:pPr>
-              <w:rPr>
-                <w:sz w:val="20"/>
-                <w:szCs w:val="20"/>
-              </w:rPr>
-            </w:pPr>
             <w:r>
-              <w:rPr>
-                <w:sz w:val="20"/>
-                <w:szCs w:val="20"/>
-              </w:rPr>
-              <w:t>User</w:t>
+              <w:t>Employee</w:t>
             </w:r>
           </w:p>
         </w:tc>
       </w:tr>
       <w:tr>
-        <w:tblPrEx>
-          <w:tblCellMar>
-            <w:top w:w="0" w:type="dxa"/>
-            <w:bottom w:w="0" w:type="dxa"/>
-          </w:tblCellMar>
-        </w:tblPrEx>
-        <w:trPr>
-          <w:cantSplit/>
-        </w:trPr>
         <w:tc>
           <w:tcPr>
-            <w:tcW w:w="4513" w:type="dxa"/>
-            <w:tcBorders>
-              <w:top w:val="single" w:sz="2" w:space="0" w:color="C8CDD5"/>
-              <w:left w:val="single" w:sz="2" w:space="0" w:color="C8CDD5"/>
-              <w:bottom w:val="single" w:sz="2" w:space="0" w:color="C8CDD5"/>
-              <w:right w:val="single" w:sz="2" w:space="0" w:color="C8CDD5"/>
-            </w:tcBorders>
-            <w:tcMar>
-              <w:top w:w="80" w:type="dxa"/>
-              <w:left w:w="120" w:type="dxa"/>
-              <w:bottom w:w="80" w:type="dxa"/>
-              <w:right w:w="120" w:type="dxa"/>
-            </w:tcMar>
-            <w:vAlign w:val="center"/>
+            <w:tcW w:type="dxa" w:w="4513"/>
           </w:tcPr>
           <w:p>
-            <w:pPr>
-              <w:rPr>
-                <w:sz w:val="20"/>
-                <w:szCs w:val="20"/>
-              </w:rPr>
-            </w:pPr>
             <w:r>
-              <w:rPr>
-                <w:sz w:val="20"/>
-                <w:szCs w:val="20"/>
-              </w:rPr>
               <w:t>egan</w:t>
             </w:r>
           </w:p>
         </w:tc>
         <w:tc>
           <w:tcPr>
-            <w:tcW w:w="4513" w:type="dxa"/>
-            <w:tcBorders>
-              <w:top w:val="single" w:sz="2" w:space="0" w:color="C8CDD5"/>
-              <w:left w:val="single" w:sz="2" w:space="0" w:color="C8CDD5"/>
-              <w:bottom w:val="single" w:sz="2" w:space="0" w:color="C8CDD5"/>
-              <w:right w:val="single" w:sz="2" w:space="0" w:color="C8CDD5"/>
-            </w:tcBorders>
-            <w:tcMar>
-              <w:top w:w="80" w:type="dxa"/>
-              <w:left w:w="120" w:type="dxa"/>
-              <w:bottom w:w="80" w:type="dxa"/>
-              <w:right w:w="120" w:type="dxa"/>
-            </w:tcMar>
-            <w:vAlign w:val="center"/>
+            <w:tcW w:type="dxa" w:w="4513"/>
           </w:tcPr>
           <w:p>
-            <w:pPr>
-              <w:rPr>
-                <w:sz w:val="20"/>
-                <w:szCs w:val="20"/>
-              </w:rPr>
-            </w:pPr>
             <w:r>
-              <w:rPr>
-                <w:sz w:val="20"/>
-                <w:szCs w:val="20"/>
-              </w:rPr>
-              <w:t>User</w:t>
+              <w:t>Employee</w:t>
             </w:r>
           </w:p>
         </w:tc>
       </w:tr>
       <w:tr>
-        <w:tblPrEx>
-          <w:tblCellMar>
-            <w:top w:w="0" w:type="dxa"/>
-            <w:bottom w:w="0" w:type="dxa"/>
-          </w:tblCellMar>
-        </w:tblPrEx>
-        <w:trPr>
-          <w:cantSplit/>
-        </w:trPr>
         <w:tc>
           <w:tcPr>
-            <w:tcW w:w="4513" w:type="dxa"/>
-            <w:tcBorders>
-              <w:top w:val="single" w:sz="2" w:space="0" w:color="C8CDD5"/>
-              <w:left w:val="single" w:sz="2" w:space="0" w:color="C8CDD5"/>
-              <w:bottom w:val="single" w:sz="2" w:space="0" w:color="C8CDD5"/>
-              <w:right w:val="single" w:sz="2" w:space="0" w:color="C8CDD5"/>
-            </w:tcBorders>
-            <w:tcMar>
-              <w:top w:w="80" w:type="dxa"/>
-              <w:left w:w="120" w:type="dxa"/>
-              <w:bottom w:w="80" w:type="dxa"/>
-              <w:right w:w="120" w:type="dxa"/>
-            </w:tcMar>
-            <w:vAlign w:val="center"/>
+            <w:tcW w:type="dxa" w:w="4513"/>
           </w:tcPr>
           <w:p>
-            <w:pPr>
-              <w:rPr>
-                <w:sz w:val="20"/>
-                <w:szCs w:val="20"/>
-              </w:rPr>
-            </w:pPr>
             <w:r>
-              <w:rPr>
-                <w:sz w:val="20"/>
-                <w:szCs w:val="20"/>
-              </w:rPr>
               <w:t>yongchuan</w:t>
             </w:r>
           </w:p>
         </w:tc>
         <w:tc>
           <w:tcPr>
-            <w:tcW w:w="4513" w:type="dxa"/>
-            <w:tcBorders>
-              <w:top w:val="single" w:sz="2" w:space="0" w:color="C8CDD5"/>
-              <w:left w:val="single" w:sz="2" w:space="0" w:color="C8CDD5"/>
-              <w:bottom w:val="single" w:sz="2" w:space="0" w:color="C8CDD5"/>
-              <w:right w:val="single" w:sz="2" w:space="0" w:color="C8CDD5"/>
-            </w:tcBorders>
-            <w:tcMar>
-              <w:top w:w="80" w:type="dxa"/>
-              <w:left w:w="120" w:type="dxa"/>
-              <w:bottom w:w="80" w:type="dxa"/>
-              <w:right w:w="120" w:type="dxa"/>
-            </w:tcMar>
-            <w:vAlign w:val="center"/>
+            <w:tcW w:type="dxa" w:w="4513"/>
           </w:tcPr>
           <w:p>
-            <w:pPr>
-              <w:rPr>
-                <w:sz w:val="20"/>
-                <w:szCs w:val="20"/>
-              </w:rPr>
-            </w:pPr>
             <w:r>
-              <w:rPr>
-                <w:sz w:val="20"/>
-                <w:szCs w:val="20"/>
-              </w:rPr>
-              <w:t>User</w:t>
+              <w:t>Employee</w:t>
             </w:r>
           </w:p>
         </w:tc>
@@ -2468,6 +1902,19 @@
       </w:pPr>
       <w:r>
         <w:t>Supported formats: JPG, PNG, PDF, MSG, DOCX, GIF, WEBP, HEIC, DOC — up to 100 MB per file.</w:t>
+      </w:r>
+    </w:p>
+    <w:p>
+      <w:pPr>
+        <w:pStyle w:val="ListParagraph"/>
+        <w:numPr>
+          <w:ilvl w:val="0"/>
+          <w:numId w:val="5"/>
+        </w:numPr>
+        <w:spacing w:after="60"/>
+      </w:pPr>
+      <w:r>
+        <w:t>Large images (JPEG, PNG, WEBP over ~1.5 MB) are automatically compressed client-side before upload — resized to a maximum of 2400 px on the longest edge and re-encoded at 82% JPEG quality. This prevents upload failures without any visible quality loss.</w:t>
       </w:r>
     </w:p>
     <w:p>
@@ -3181,7 +2628,7 @@
         <w:spacing w:after="160"/>
       </w:pPr>
       <w:r>
-        <w:t>The dashboard opens on a summary strip with five live counters:</w:t>
+        <w:t>The dashboard opens on a summary strip with four live counters:</w:t>
       </w:r>
     </w:p>
     <w:tbl>
@@ -3539,71 +2986,6 @@
           </w:p>
         </w:tc>
       </w:tr>
-      <w:tr>
-        <w:tblPrEx>
-          <w:tblCellMar>
-            <w:top w:w="0" w:type="dxa"/>
-            <w:bottom w:w="0" w:type="dxa"/>
-          </w:tblCellMar>
-        </w:tblPrEx>
-        <w:trPr>
-          <w:cantSplit/>
-        </w:trPr>
-        <w:tc>
-          <w:tcPr>
-            <w:tcW w:w="3200" w:type="dxa"/>
-            <w:tcBorders>
-              <w:top w:val="single" w:sz="2" w:space="0" w:color="C8CDD5"/>
-              <w:left w:val="single" w:sz="2" w:space="0" w:color="C8CDD5"/>
-              <w:bottom w:val="single" w:sz="2" w:space="0" w:color="C8CDD5"/>
-              <w:right w:val="single" w:sz="2" w:space="0" w:color="C8CDD5"/>
-            </w:tcBorders>
-            <w:tcMar>
-              <w:top w:w="80" w:type="dxa"/>
-              <w:left w:w="120" w:type="dxa"/>
-              <w:bottom w:w="80" w:type="dxa"/>
-              <w:right w:w="120" w:type="dxa"/>
-            </w:tcMar>
-            <w:vAlign w:val="center"/>
-          </w:tcPr>
-          <w:p>
-            <w:r>
-              <w:rPr>
-                <w:sz w:val="20"/>
-                <w:szCs w:val="20"/>
-              </w:rPr>
-              <w:t>Total Approved (SGD)</w:t>
-            </w:r>
-          </w:p>
-        </w:tc>
-        <w:tc>
-          <w:tcPr>
-            <w:tcW w:w="5826" w:type="dxa"/>
-            <w:tcBorders>
-              <w:top w:val="single" w:sz="2" w:space="0" w:color="C8CDD5"/>
-              <w:left w:val="single" w:sz="2" w:space="0" w:color="C8CDD5"/>
-              <w:bottom w:val="single" w:sz="2" w:space="0" w:color="C8CDD5"/>
-              <w:right w:val="single" w:sz="2" w:space="0" w:color="C8CDD5"/>
-            </w:tcBorders>
-            <w:tcMar>
-              <w:top w:w="80" w:type="dxa"/>
-              <w:left w:w="120" w:type="dxa"/>
-              <w:bottom w:w="80" w:type="dxa"/>
-              <w:right w:w="120" w:type="dxa"/>
-            </w:tcMar>
-            <w:vAlign w:val="center"/>
-          </w:tcPr>
-          <w:p>
-            <w:r>
-              <w:rPr>
-                <w:sz w:val="20"/>
-                <w:szCs w:val="20"/>
-              </w:rPr>
-              <w:t>Sum of the Approved claims' amounts.</w:t>
-            </w:r>
-          </w:p>
-        </w:tc>
-      </w:tr>
     </w:tbl>
     <w:p>
       <w:pPr>
@@ -3766,6 +3148,19 @@
       </w:pPr>
       <w:r>
         <w:t>Click any of the underlined column headers (Submitted, Employee, Claim #, Amount) to sort the table by that column; click again to reverse the order.</w:t>
+      </w:r>
+    </w:p>
+    <w:p>
+      <w:pPr>
+        <w:pStyle w:val="ListParagraph"/>
+        <w:numPr>
+          <w:ilvl w:val="0"/>
+          <w:numId w:val="5"/>
+        </w:numPr>
+        <w:spacing w:after="60"/>
+      </w:pPr>
+      <w:r>
+        <w:t>Use the “Show Archived” toggle in the filter bar to include or hide archived claims. Archived claims are dimmed with an Archived badge and excluded from the default view.</w:t>
       </w:r>
     </w:p>
     <w:tbl>
@@ -4161,26 +3556,6 @@
     </w:p>
     <w:p>
       <w:pPr>
-        <w:pStyle w:val="Heading2"/>
-        <w:keepNext/>
-        <w:keepLines/>
-      </w:pPr>
-      <w:bookmarkStart w:id="19" w:name="bm_4_6_settings_claim_numbering"/>
-      <w:r>
-        <w:t>4.6 Settings — claim numbering</w:t>
-      </w:r>
-      <w:bookmarkEnd w:id="19"/>
-    </w:p>
-    <w:p>
-      <w:pPr>
-        <w:spacing w:after="160"/>
-      </w:pPr>
-      <w:r>
-        <w:t>Open Settings from the Admin Dashboard top bar to control the sequential numbering Finance uses for new claims.</w:t>
-      </w:r>
-    </w:p>
-    <w:p>
-      <w:pPr>
         <w:pStyle w:val="ListParagraph"/>
         <w:numPr>
           <w:ilvl w:val="0"/>
@@ -4189,7 +3564,7 @@
         <w:spacing w:after="60"/>
       </w:pPr>
       <w:r>
-        <w:t>Next claim number — sets the number the next newly submitted claim will receive; every claim after that increments automatically.</w:t>
+        <w:t>Submit on behalf of employee — when creating a new claim as Admin, select the employee from the Name dropdown. The submitted claim appears in that employee’s own History, as if they submitted it themselves.</w:t>
       </w:r>
     </w:p>
     <w:p>
@@ -4202,7 +3577,47 @@
         <w:spacing w:after="60"/>
       </w:pPr>
       <w:r>
-        <w:t>A live preview line updates as you type, showing exactly what the next claim number will be.</w:t>
+        <w:t>Archive / Unarchive — click Archive in the drawer footer to hide a resolved claim from the default view. Toggle “Show Archived” to find it, then Unarchive to restore it.</w:t>
+      </w:r>
+    </w:p>
+    <w:p>
+      <w:pPr>
+        <w:pStyle w:val="Heading2"/>
+        <w:keepNext/>
+        <w:keepLines/>
+      </w:pPr>
+      <w:r>
+        <w:t>4.6 Monthly ZIP Export</w:t>
+      </w:r>
+    </w:p>
+    <w:p>
+      <w:pPr>
+        <w:spacing w:after="160"/>
+      </w:pPr>
+      <w:r>
+        <w:t>Open the Export Month dialog from the Admin Dashboard filter bar. Select the year-month and click Download ZIP. The server packages all non-archived claims whose expense period ends in that month into one ZIP file, structured as:
+    0. Claims / {n}. {FirstName} – {ClaimNo} / Claim_{ClaimNo}.xlsx + receipts
+Receipt files are prefixed with their line-item number (e.g. 1. receiptA.jpg, 1. receiptB.pdf, 2. statement.pdf), making it easy to match each receipt to its expense row.</w:t>
+      </w:r>
+    </w:p>
+    <w:p>
+      <w:pPr>
+        <w:pStyle w:val="Heading2"/>
+        <w:keepNext/>
+        <w:keepLines/>
+      </w:pPr>
+      <w:bookmarkStart w:id="19" w:name="bm_4_6_settings_claim_numbering"/>
+      <w:r>
+        <w:t>4.7 Settings — claim numbering</w:t>
+      </w:r>
+      <w:bookmarkEnd w:id="19"/>
+    </w:p>
+    <w:p>
+      <w:pPr>
+        <w:spacing w:after="160"/>
+      </w:pPr>
+      <w:r>
+        <w:t>Open Settings from the Admin Dashboard top bar to control the sequential numbering Finance uses for new claims.</w:t>
       </w:r>
     </w:p>
     <w:p>
@@ -4215,7 +3630,46 @@
         <w:spacing w:after="60"/>
       </w:pPr>
       <w:r>
+        <w:t>Next claim number — sets the number the next newly submitted claim will receive; every claim after that increments automatically.</w:t>
+      </w:r>
+    </w:p>
+    <w:p>
+      <w:pPr>
+        <w:pStyle w:val="ListParagraph"/>
+        <w:numPr>
+          <w:ilvl w:val="0"/>
+          <w:numId w:val="5"/>
+        </w:numPr>
+        <w:spacing w:after="60"/>
+      </w:pPr>
+      <w:r>
+        <w:t>A live preview line updates as you type, showing exactly what the next claim number will be.</w:t>
+      </w:r>
+    </w:p>
+    <w:p>
+      <w:pPr>
+        <w:pStyle w:val="ListParagraph"/>
+        <w:numPr>
+          <w:ilvl w:val="0"/>
+          <w:numId w:val="5"/>
+        </w:numPr>
+        <w:spacing w:after="60"/>
+      </w:pPr>
+      <w:r>
         <w:t>Click Save (or press Enter) to commit the change; a “✓ Saved” confirmation briefly appears.</w:t>
+      </w:r>
+    </w:p>
+    <w:p>
+      <w:pPr>
+        <w:pStyle w:val="ListParagraph"/>
+        <w:numPr>
+          <w:ilvl w:val="0"/>
+          <w:numId w:val="5"/>
+        </w:numPr>
+        <w:spacing w:after="60"/>
+      </w:pPr>
+      <w:r>
+        <w:t>User Management — the second card on the Settings page lists every portal account. Admins can update any employee’s display name and optionally reset their password. Login usernames are fixed and cannot be changed. Leave the password field blank to keep the current password.</w:t>
       </w:r>
     </w:p>
     <w:tbl>

</xml_diff>